<commit_message>
Remove legacy prep images; reword scope advice on the project-selection chapter
- Delete six decorative/AI-generated images from student-facing prep folders and drop all references
- Week 2 AM card: reframe 'too technical' warning (business research) and ask whether the topic is too ambitious

Co-Authored-By: Claude Sonnet 5.5 <noreply@anthropic.com>
Claude-Session: https://claude.ai/code/session_012ofQG9mjRGTuapUKfGwMWr
</commit_message>
<xml_diff>
--- a/Week 1_AM/Pre-Session Prep/COM7401 CAMPUS - Pre-Session Card - Week 1 AM.docx
+++ b/Week 1_AM/Pre-Session Prep/COM7401 CAMPUS - Pre-Session Card - Week 1 AM.docx
@@ -775,11 +775,6 @@
         <w:t>Next is Session 2: ontology and research paradigms. The preparation for it starts with the readings on its card.</w:t>
       </w:r>
     </w:p>
-    <w:p>
-      <w:r>
-        <w:t>The module images in the Week 1 folder are decorative and carry no content, so you do not need to study them.</w:t>
-      </w:r>
-    </w:p>
     <w:sectPr>
       <w:headerReference w:type="default" r:id="rId9"/>
       <w:footerReference w:type="default" r:id="rId10"/>

</xml_diff>